<commit_message>
Episode_2: The evolution of AI
</commit_message>
<xml_diff>
--- a/AI/Episode_2/TheEvolutionOfAI.docx
+++ b/AI/Episode_2/TheEvolutionOfAI.docx
@@ -500,6 +500,755 @@
           <w:lang w:val="en-US"/>
         </w:rPr>
         <w:t>- Makes predictions</w:t>
+      </w:r>
+    </w:p>
+    <w:p>
+      <w:pPr>
+        <w:rPr>
+          <w:sz w:val="24"/>
+          <w:szCs w:val="24"/>
+          <w:lang w:val="en-US"/>
+        </w:rPr>
+      </w:pPr>
+    </w:p>
+    <w:p>
+      <w:pPr>
+        <w:pStyle w:val="ListParagraph"/>
+        <w:numPr>
+          <w:ilvl w:val="0"/>
+          <w:numId w:val="1"/>
+        </w:numPr>
+        <w:rPr>
+          <w:sz w:val="24"/>
+          <w:szCs w:val="24"/>
+          <w:lang w:val="en-US"/>
+        </w:rPr>
+      </w:pPr>
+      <w:r>
+        <w:rPr>
+          <w:sz w:val="24"/>
+          <w:szCs w:val="24"/>
+          <w:lang w:val="en-US"/>
+        </w:rPr>
+        <w:t>Deep Learning – Neural networks. Can computer learn features by themselves?</w:t>
+      </w:r>
+    </w:p>
+    <w:p>
+      <w:pPr>
+        <w:pStyle w:val="ListParagraph"/>
+        <w:ind w:left="1440"/>
+        <w:rPr>
+          <w:sz w:val="24"/>
+          <w:szCs w:val="24"/>
+          <w:lang w:val="en-US"/>
+        </w:rPr>
+      </w:pPr>
+      <w:r>
+        <w:rPr>
+          <w:sz w:val="24"/>
+          <w:szCs w:val="24"/>
+          <w:lang w:val="en-US"/>
+        </w:rPr>
+        <w:t>Instead of humans telling this is an ‘eye’, can computer discover ‘eye’ automatically.</w:t>
+      </w:r>
+    </w:p>
+    <w:p>
+      <w:pPr>
+        <w:rPr>
+          <w:sz w:val="24"/>
+          <w:szCs w:val="24"/>
+          <w:lang w:val="en-US"/>
+        </w:rPr>
+      </w:pPr>
+      <w:r>
+        <w:rPr>
+          <w:sz w:val="24"/>
+          <w:szCs w:val="24"/>
+          <w:lang w:val="en-US"/>
+        </w:rPr>
+        <w:tab/>
+        <w:t>Examples:</w:t>
+      </w:r>
+    </w:p>
+    <w:p>
+      <w:pPr>
+        <w:pStyle w:val="ListParagraph"/>
+        <w:numPr>
+          <w:ilvl w:val="0"/>
+          <w:numId w:val="2"/>
+        </w:numPr>
+        <w:rPr>
+          <w:sz w:val="24"/>
+          <w:szCs w:val="24"/>
+          <w:lang w:val="en-US"/>
+        </w:rPr>
+      </w:pPr>
+      <w:r>
+        <w:rPr>
+          <w:sz w:val="24"/>
+          <w:szCs w:val="24"/>
+          <w:lang w:val="en-US"/>
+        </w:rPr>
+        <w:t>Image recognition (face unlock)</w:t>
+      </w:r>
+    </w:p>
+    <w:p>
+      <w:pPr>
+        <w:pStyle w:val="ListParagraph"/>
+        <w:numPr>
+          <w:ilvl w:val="0"/>
+          <w:numId w:val="2"/>
+        </w:numPr>
+        <w:rPr>
+          <w:sz w:val="24"/>
+          <w:szCs w:val="24"/>
+          <w:lang w:val="en-US"/>
+        </w:rPr>
+      </w:pPr>
+      <w:r>
+        <w:rPr>
+          <w:sz w:val="24"/>
+          <w:szCs w:val="24"/>
+          <w:lang w:val="en-US"/>
+        </w:rPr>
+        <w:lastRenderedPageBreak/>
+        <w:t>Speech recognition</w:t>
+      </w:r>
+    </w:p>
+    <w:p>
+      <w:pPr>
+        <w:pStyle w:val="ListParagraph"/>
+        <w:numPr>
+          <w:ilvl w:val="0"/>
+          <w:numId w:val="2"/>
+        </w:numPr>
+        <w:rPr>
+          <w:sz w:val="24"/>
+          <w:szCs w:val="24"/>
+          <w:lang w:val="en-US"/>
+        </w:rPr>
+      </w:pPr>
+      <w:r>
+        <w:rPr>
+          <w:sz w:val="24"/>
+          <w:szCs w:val="24"/>
+          <w:lang w:val="en-US"/>
+        </w:rPr>
+        <w:t>Translation</w:t>
+      </w:r>
+    </w:p>
+    <w:p>
+      <w:pPr>
+        <w:pStyle w:val="ListParagraph"/>
+        <w:numPr>
+          <w:ilvl w:val="0"/>
+          <w:numId w:val="2"/>
+        </w:numPr>
+        <w:rPr>
+          <w:sz w:val="24"/>
+          <w:szCs w:val="24"/>
+          <w:lang w:val="en-US"/>
+        </w:rPr>
+      </w:pPr>
+      <w:r>
+        <w:rPr>
+          <w:sz w:val="24"/>
+          <w:szCs w:val="24"/>
+          <w:lang w:val="en-US"/>
+        </w:rPr>
+        <w:t>GPU revolution + Internet + Large datasets</w:t>
+      </w:r>
+    </w:p>
+    <w:p>
+      <w:pPr>
+        <w:rPr>
+          <w:sz w:val="24"/>
+          <w:szCs w:val="24"/>
+          <w:lang w:val="en-US"/>
+        </w:rPr>
+      </w:pPr>
+    </w:p>
+    <w:p>
+      <w:pPr>
+        <w:pStyle w:val="ListParagraph"/>
+        <w:numPr>
+          <w:ilvl w:val="0"/>
+          <w:numId w:val="1"/>
+        </w:numPr>
+        <w:rPr>
+          <w:sz w:val="24"/>
+          <w:szCs w:val="24"/>
+          <w:lang w:val="en-US"/>
+        </w:rPr>
+      </w:pPr>
+      <w:r>
+        <w:rPr>
+          <w:sz w:val="24"/>
+          <w:szCs w:val="24"/>
+          <w:lang w:val="en-US"/>
+        </w:rPr>
+        <w:t>Differences between machine learning and deep learning:</w:t>
+      </w:r>
+    </w:p>
+    <w:p>
+      <w:pPr>
+        <w:pStyle w:val="ListParagraph"/>
+        <w:rPr>
+          <w:sz w:val="24"/>
+          <w:szCs w:val="24"/>
+          <w:lang w:val="en-US"/>
+        </w:rPr>
+      </w:pPr>
+      <w:r>
+        <w:rPr>
+          <w:sz w:val="24"/>
+          <w:szCs w:val="24"/>
+          <w:lang w:val="en-US"/>
+        </w:rPr>
+        <w:t>Machine Learning:</w:t>
+      </w:r>
+    </w:p>
+    <w:p>
+      <w:pPr>
+        <w:pStyle w:val="ListParagraph"/>
+        <w:numPr>
+          <w:ilvl w:val="0"/>
+          <w:numId w:val="2"/>
+        </w:numPr>
+        <w:rPr>
+          <w:sz w:val="24"/>
+          <w:szCs w:val="24"/>
+          <w:lang w:val="en-US"/>
+        </w:rPr>
+      </w:pPr>
+      <w:r>
+        <w:rPr>
+          <w:sz w:val="24"/>
+          <w:szCs w:val="24"/>
+          <w:lang w:val="en-US"/>
+        </w:rPr>
+        <w:t>A subset of AI that uses algos to analyze data, learn from it, and make decisions/predictions.</w:t>
+      </w:r>
+    </w:p>
+    <w:p>
+      <w:pPr>
+        <w:pStyle w:val="ListParagraph"/>
+        <w:numPr>
+          <w:ilvl w:val="0"/>
+          <w:numId w:val="2"/>
+        </w:numPr>
+        <w:rPr>
+          <w:sz w:val="24"/>
+          <w:szCs w:val="24"/>
+          <w:lang w:val="en-US"/>
+        </w:rPr>
+      </w:pPr>
+      <w:r>
+        <w:rPr>
+          <w:sz w:val="24"/>
+          <w:szCs w:val="24"/>
+          <w:lang w:val="en-US"/>
+        </w:rPr>
+        <w:t xml:space="preserve">Features: </w:t>
+      </w:r>
+    </w:p>
+    <w:p>
+      <w:pPr>
+        <w:pStyle w:val="ListParagraph"/>
+        <w:numPr>
+          <w:ilvl w:val="1"/>
+          <w:numId w:val="2"/>
+        </w:numPr>
+        <w:rPr>
+          <w:sz w:val="24"/>
+          <w:szCs w:val="24"/>
+          <w:lang w:val="en-US"/>
+        </w:rPr>
+      </w:pPr>
+      <w:r>
+        <w:rPr>
+          <w:sz w:val="24"/>
+          <w:szCs w:val="24"/>
+          <w:lang w:val="en-US"/>
+        </w:rPr>
+        <w:t>Require smaller datasets</w:t>
+      </w:r>
+    </w:p>
+    <w:p>
+      <w:pPr>
+        <w:pStyle w:val="ListParagraph"/>
+        <w:numPr>
+          <w:ilvl w:val="1"/>
+          <w:numId w:val="2"/>
+        </w:numPr>
+        <w:rPr>
+          <w:sz w:val="24"/>
+          <w:szCs w:val="24"/>
+          <w:lang w:val="en-US"/>
+        </w:rPr>
+      </w:pPr>
+      <w:r>
+        <w:rPr>
+          <w:sz w:val="24"/>
+          <w:szCs w:val="24"/>
+          <w:lang w:val="en-US"/>
+        </w:rPr>
+        <w:t>Faster training</w:t>
+      </w:r>
+    </w:p>
+    <w:p>
+      <w:pPr>
+        <w:pStyle w:val="ListParagraph"/>
+        <w:numPr>
+          <w:ilvl w:val="1"/>
+          <w:numId w:val="2"/>
+        </w:numPr>
+        <w:rPr>
+          <w:sz w:val="24"/>
+          <w:szCs w:val="24"/>
+          <w:lang w:val="en-US"/>
+        </w:rPr>
+      </w:pPr>
+      <w:r>
+        <w:rPr>
+          <w:sz w:val="24"/>
+          <w:szCs w:val="24"/>
+          <w:lang w:val="en-US"/>
+        </w:rPr>
+        <w:t>Structured data</w:t>
+      </w:r>
+    </w:p>
+    <w:p>
+      <w:pPr>
+        <w:pStyle w:val="ListParagraph"/>
+        <w:numPr>
+          <w:ilvl w:val="1"/>
+          <w:numId w:val="2"/>
+        </w:numPr>
+        <w:rPr>
+          <w:sz w:val="24"/>
+          <w:szCs w:val="24"/>
+          <w:lang w:val="en-US"/>
+        </w:rPr>
+      </w:pPr>
+      <w:r>
+        <w:rPr>
+          <w:sz w:val="24"/>
+          <w:szCs w:val="24"/>
+          <w:lang w:val="en-US"/>
+        </w:rPr>
+        <w:t>Feature engineering (manual intervention is reqd.)</w:t>
+      </w:r>
+    </w:p>
+    <w:p>
+      <w:pPr>
+        <w:pStyle w:val="ListParagraph"/>
+        <w:numPr>
+          <w:ilvl w:val="0"/>
+          <w:numId w:val="2"/>
+        </w:numPr>
+        <w:rPr>
+          <w:sz w:val="24"/>
+          <w:szCs w:val="24"/>
+          <w:lang w:val="en-US"/>
+        </w:rPr>
+      </w:pPr>
+      <w:r>
+        <w:rPr>
+          <w:sz w:val="24"/>
+          <w:szCs w:val="24"/>
+          <w:lang w:val="en-US"/>
+        </w:rPr>
+        <w:t>Examples:</w:t>
+      </w:r>
+    </w:p>
+    <w:p>
+      <w:pPr>
+        <w:pStyle w:val="ListParagraph"/>
+        <w:numPr>
+          <w:ilvl w:val="1"/>
+          <w:numId w:val="2"/>
+        </w:numPr>
+        <w:rPr>
+          <w:sz w:val="24"/>
+          <w:szCs w:val="24"/>
+          <w:lang w:val="en-US"/>
+        </w:rPr>
+      </w:pPr>
+      <w:r>
+        <w:rPr>
+          <w:sz w:val="24"/>
+          <w:szCs w:val="24"/>
+          <w:lang w:val="en-US"/>
+        </w:rPr>
+        <w:t>Spam detection</w:t>
+      </w:r>
+    </w:p>
+    <w:p>
+      <w:pPr>
+        <w:pStyle w:val="ListParagraph"/>
+        <w:numPr>
+          <w:ilvl w:val="1"/>
+          <w:numId w:val="2"/>
+        </w:numPr>
+        <w:rPr>
+          <w:sz w:val="24"/>
+          <w:szCs w:val="24"/>
+          <w:lang w:val="en-US"/>
+        </w:rPr>
+      </w:pPr>
+      <w:r>
+        <w:rPr>
+          <w:sz w:val="24"/>
+          <w:szCs w:val="24"/>
+          <w:lang w:val="en-US"/>
+        </w:rPr>
+        <w:t>House pricing prediction</w:t>
+      </w:r>
+    </w:p>
+    <w:p>
+      <w:pPr>
+        <w:ind w:left="720"/>
+        <w:rPr>
+          <w:sz w:val="24"/>
+          <w:szCs w:val="24"/>
+          <w:lang w:val="en-US"/>
+        </w:rPr>
+      </w:pPr>
+    </w:p>
+    <w:p>
+      <w:pPr>
+        <w:ind w:left="720"/>
+        <w:rPr>
+          <w:sz w:val="24"/>
+          <w:szCs w:val="24"/>
+          <w:lang w:val="en-US"/>
+        </w:rPr>
+      </w:pPr>
+      <w:r>
+        <w:rPr>
+          <w:sz w:val="24"/>
+          <w:szCs w:val="24"/>
+          <w:lang w:val="en-US"/>
+        </w:rPr>
+        <w:t>Deep Learning:</w:t>
+      </w:r>
+    </w:p>
+    <w:p>
+      <w:pPr>
+        <w:pStyle w:val="ListParagraph"/>
+        <w:numPr>
+          <w:ilvl w:val="0"/>
+          <w:numId w:val="2"/>
+        </w:numPr>
+        <w:rPr>
+          <w:sz w:val="24"/>
+          <w:szCs w:val="24"/>
+          <w:lang w:val="en-US"/>
+        </w:rPr>
+      </w:pPr>
+      <w:r>
+        <w:rPr>
+          <w:sz w:val="24"/>
+          <w:szCs w:val="24"/>
+          <w:lang w:val="en-US"/>
+        </w:rPr>
+        <w:t>A specialized subset of ML based on artificial neural networks(ANNs) inspired by the human brain.</w:t>
+      </w:r>
+    </w:p>
+    <w:p>
+      <w:pPr>
+        <w:pStyle w:val="ListParagraph"/>
+        <w:numPr>
+          <w:ilvl w:val="0"/>
+          <w:numId w:val="2"/>
+        </w:numPr>
+        <w:rPr>
+          <w:sz w:val="24"/>
+          <w:szCs w:val="24"/>
+          <w:lang w:val="en-US"/>
+        </w:rPr>
+      </w:pPr>
+      <w:r>
+        <w:rPr>
+          <w:sz w:val="24"/>
+          <w:szCs w:val="24"/>
+          <w:lang w:val="en-US"/>
+        </w:rPr>
+        <w:t>Features:</w:t>
+      </w:r>
+    </w:p>
+    <w:p>
+      <w:pPr>
+        <w:pStyle w:val="ListParagraph"/>
+        <w:numPr>
+          <w:ilvl w:val="1"/>
+          <w:numId w:val="2"/>
+        </w:numPr>
+        <w:rPr>
+          <w:sz w:val="24"/>
+          <w:szCs w:val="24"/>
+          <w:lang w:val="en-US"/>
+        </w:rPr>
+      </w:pPr>
+      <w:r>
+        <w:rPr>
+          <w:sz w:val="24"/>
+          <w:szCs w:val="24"/>
+          <w:lang w:val="en-US"/>
+        </w:rPr>
+        <w:t>Requires vast datasets (Big data) – Computationally intensive (GPUs)</w:t>
+      </w:r>
+    </w:p>
+    <w:p>
+      <w:pPr>
+        <w:pStyle w:val="ListParagraph"/>
+        <w:numPr>
+          <w:ilvl w:val="1"/>
+          <w:numId w:val="2"/>
+        </w:numPr>
+        <w:rPr>
+          <w:sz w:val="24"/>
+          <w:szCs w:val="24"/>
+          <w:lang w:val="en-US"/>
+        </w:rPr>
+      </w:pPr>
+      <w:r>
+        <w:rPr>
+          <w:sz w:val="24"/>
+          <w:szCs w:val="24"/>
+          <w:lang w:val="en-US"/>
+        </w:rPr>
+        <w:t>Unstructured data (Images, text, audio) – Automated feature learning</w:t>
+      </w:r>
+    </w:p>
+    <w:p>
+      <w:pPr>
+        <w:pStyle w:val="ListParagraph"/>
+        <w:numPr>
+          <w:ilvl w:val="0"/>
+          <w:numId w:val="2"/>
+        </w:numPr>
+        <w:rPr>
+          <w:sz w:val="24"/>
+          <w:szCs w:val="24"/>
+          <w:lang w:val="en-US"/>
+        </w:rPr>
+      </w:pPr>
+      <w:r>
+        <w:rPr>
+          <w:sz w:val="24"/>
+          <w:szCs w:val="24"/>
+          <w:lang w:val="en-US"/>
+        </w:rPr>
+        <w:t>Examples:</w:t>
+      </w:r>
+    </w:p>
+    <w:p>
+      <w:pPr>
+        <w:pStyle w:val="ListParagraph"/>
+        <w:numPr>
+          <w:ilvl w:val="1"/>
+          <w:numId w:val="2"/>
+        </w:numPr>
+        <w:rPr>
+          <w:sz w:val="24"/>
+          <w:szCs w:val="24"/>
+          <w:lang w:val="en-US"/>
+        </w:rPr>
+      </w:pPr>
+      <w:r>
+        <w:rPr>
+          <w:sz w:val="24"/>
+          <w:szCs w:val="24"/>
+          <w:lang w:val="en-US"/>
+        </w:rPr>
+        <w:t>Image recognition</w:t>
+      </w:r>
+    </w:p>
+    <w:p>
+      <w:pPr>
+        <w:pStyle w:val="ListParagraph"/>
+        <w:numPr>
+          <w:ilvl w:val="1"/>
+          <w:numId w:val="2"/>
+        </w:numPr>
+        <w:rPr>
+          <w:sz w:val="24"/>
+          <w:szCs w:val="24"/>
+          <w:lang w:val="en-US"/>
+        </w:rPr>
+      </w:pPr>
+      <w:r>
+        <w:rPr>
+          <w:sz w:val="24"/>
+          <w:szCs w:val="24"/>
+          <w:lang w:val="en-US"/>
+        </w:rPr>
+        <w:t>Natural language processing (NLP)</w:t>
+      </w:r>
+    </w:p>
+    <w:p>
+      <w:pPr>
+        <w:rPr>
+          <w:sz w:val="24"/>
+          <w:szCs w:val="24"/>
+          <w:lang w:val="en-US"/>
+        </w:rPr>
+      </w:pPr>
+    </w:p>
+    <w:p>
+      <w:pPr>
+        <w:pStyle w:val="ListParagraph"/>
+        <w:numPr>
+          <w:ilvl w:val="0"/>
+          <w:numId w:val="1"/>
+        </w:numPr>
+        <w:rPr>
+          <w:sz w:val="24"/>
+          <w:szCs w:val="24"/>
+          <w:lang w:val="en-US"/>
+        </w:rPr>
+      </w:pPr>
+      <w:r>
+        <w:rPr>
+          <w:sz w:val="24"/>
+          <w:szCs w:val="24"/>
+          <w:lang w:val="en-US"/>
+        </w:rPr>
+        <w:t>Natural Language Processing:</w:t>
+      </w:r>
+    </w:p>
+    <w:p>
+      <w:pPr>
+        <w:pStyle w:val="ListParagraph"/>
+        <w:numPr>
+          <w:ilvl w:val="0"/>
+          <w:numId w:val="2"/>
+        </w:numPr>
+        <w:rPr>
+          <w:sz w:val="24"/>
+          <w:szCs w:val="24"/>
+          <w:lang w:val="en-US"/>
+        </w:rPr>
+      </w:pPr>
+      <w:r>
+        <w:rPr>
+          <w:sz w:val="24"/>
+          <w:szCs w:val="24"/>
+          <w:lang w:val="en-US"/>
+        </w:rPr>
+        <w:t>I saw a man with a telescope: This cannot be determined whether the man is holding a telescope and saw another man / The man saw another man holding a telescope.</w:t>
+      </w:r>
+    </w:p>
+    <w:p>
+      <w:pPr>
+        <w:pStyle w:val="ListParagraph"/>
+        <w:numPr>
+          <w:ilvl w:val="0"/>
+          <w:numId w:val="2"/>
+        </w:numPr>
+        <w:rPr>
+          <w:sz w:val="24"/>
+          <w:szCs w:val="24"/>
+          <w:lang w:val="en-US"/>
+        </w:rPr>
+      </w:pPr>
+      <w:r>
+        <w:rPr>
+          <w:sz w:val="24"/>
+          <w:szCs w:val="24"/>
+          <w:lang w:val="en-US"/>
+        </w:rPr>
+        <w:t>The chicken is ready to eat: Cannot determine whether the chicken is the food that is to be eatem / The chicken is served with food.</w:t>
+      </w:r>
+    </w:p>
+    <w:p>
+      <w:pPr>
+        <w:pStyle w:val="ListParagraph"/>
+        <w:numPr>
+          <w:ilvl w:val="0"/>
+          <w:numId w:val="2"/>
+        </w:numPr>
+        <w:rPr>
+          <w:sz w:val="24"/>
+          <w:szCs w:val="24"/>
+          <w:lang w:val="en-US"/>
+        </w:rPr>
+      </w:pPr>
+      <w:r>
+        <w:rPr>
+          <w:sz w:val="24"/>
+          <w:szCs w:val="24"/>
+          <w:lang w:val="en-US"/>
+        </w:rPr>
+        <w:t>Bag of words</w:t>
+      </w:r>
+    </w:p>
+    <w:p>
+      <w:pPr>
+        <w:pStyle w:val="ListParagraph"/>
+        <w:numPr>
+          <w:ilvl w:val="0"/>
+          <w:numId w:val="2"/>
+        </w:numPr>
+        <w:rPr>
+          <w:sz w:val="24"/>
+          <w:szCs w:val="24"/>
+          <w:lang w:val="en-US"/>
+        </w:rPr>
+      </w:pPr>
+      <w:r>
+        <w:rPr>
+          <w:sz w:val="24"/>
+          <w:szCs w:val="24"/>
+          <w:lang w:val="en-US"/>
+        </w:rPr>
+        <w:t>N-grams</w:t>
+      </w:r>
+    </w:p>
+    <w:p>
+      <w:pPr>
+        <w:pStyle w:val="ListParagraph"/>
+        <w:numPr>
+          <w:ilvl w:val="0"/>
+          <w:numId w:val="2"/>
+        </w:numPr>
+        <w:rPr>
+          <w:sz w:val="24"/>
+          <w:szCs w:val="24"/>
+          <w:lang w:val="en-US"/>
+        </w:rPr>
+      </w:pPr>
+      <w:r>
+        <w:rPr>
+          <w:sz w:val="24"/>
+          <w:szCs w:val="24"/>
+          <w:lang w:val="en-US"/>
+        </w:rPr>
+        <w:t>RNN (Recurrent Neural Networks)</w:t>
+      </w:r>
+    </w:p>
+    <w:p>
+      <w:pPr>
+        <w:pStyle w:val="ListParagraph"/>
+        <w:numPr>
+          <w:ilvl w:val="0"/>
+          <w:numId w:val="2"/>
+        </w:numPr>
+        <w:rPr>
+          <w:sz w:val="24"/>
+          <w:szCs w:val="24"/>
+          <w:lang w:val="en-US"/>
+        </w:rPr>
+      </w:pPr>
+      <w:r>
+        <w:rPr>
+          <w:sz w:val="24"/>
+          <w:szCs w:val="24"/>
+          <w:lang w:val="en-US"/>
+        </w:rPr>
+        <w:t>LSTM (Long-short term memory) – much better RNN</w:t>
       </w:r>
     </w:p>
     <w:sectPr>
@@ -530,7 +1279,7 @@
         <w:rFonts w:hint="default"/>
       </w:rPr>
     </w:lvl>
-    <w:lvl w:ilvl="1" w:tplc="40090019" w:tentative="1">
+    <w:lvl w:ilvl="1" w:tplc="40090019">
       <w:start w:val="1"/>
       <w:numFmt w:val="lowerLetter"/>
       <w:lvlText w:val="%2."/>
@@ -619,7 +1368,7 @@
         <w:rFonts w:ascii="Calibri" w:eastAsiaTheme="minorHAnsi" w:hAnsi="Calibri" w:cs="Calibri" w:hint="default"/>
       </w:rPr>
     </w:lvl>
-    <w:lvl w:ilvl="1" w:tplc="40090003" w:tentative="1">
+    <w:lvl w:ilvl="1" w:tplc="40090003">
       <w:start w:val="1"/>
       <w:numFmt w:val="bullet"/>
       <w:lvlText w:val="o"/>

</xml_diff>